<commit_message>
Deploying to gh-pages from @ Morrison-Lab/mds@b070222e65e93c2047ae13dec9debd814a1cef1f 🚀
</commit_message>
<xml_diff>
--- a/algebra-complex.docx
+++ b/algebra-complex.docx
@@ -15,10 +15,10 @@
         <w:pStyle w:val="Date"/>
       </w:pPr>
       <w:r>
-        <w:t xml:space="preserve">Last modified: 2026-10-15 14:23:59 (PDT)</w:t>
+        <w:t xml:space="preserve">Last modified: 2026-10-15 15:19:18 (PDT)</w:t>
       </w:r>
     </w:p>
-    <w:bookmarkStart w:id="33" w:name="sec-complex-numbers"/>
+    <w:bookmarkStart w:id="36" w:name="sec-complex-numbers"/>
     <w:p>
       <w:pPr>
         <w:pStyle w:val="Heading2"/>
@@ -2728,60 +2728,22 @@
       <w:r>
         <w:t xml:space="preserve">).</w:t>
       </w:r>
-    </w:p>
-    <w:p>
-      <w:pPr>
-        <w:pStyle w:val="Compact"/>
-        <w:numPr>
-          <w:ilvl w:val="0"/>
-          <w:numId w:val="1003"/>
-        </w:numPr>
-      </w:pPr>
-      <w:r>
-        <w:t xml:space="preserve">The</w:t>
-      </w:r>
-      <w:r>
-        <w:t xml:space="preserve"> </w:t>
-      </w:r>
-      <w:r>
-        <w:rPr>
-          <w:b/>
-          <w:bCs/>
-        </w:rPr>
-        <w:t xml:space="preserve">real part</w:t>
-      </w:r>
-      <w:r>
-        <w:t xml:space="preserve"> </w:t>
-      </w:r>
-      <w:r>
-        <w:t xml:space="preserve">of</w:t>
+      <w:r>
+        <w:t xml:space="preserve"> </w:t>
+      </w:r>
+      <w:r>
+        <w:t xml:space="preserve">The set of all complex numbers is</w:t>
       </w:r>
       <w:r>
         <w:t xml:space="preserve"> </w:t>
       </w:r>
       <m:oMath>
         <m:r>
-          <m:t>z</m:t>
-        </m:r>
-      </m:oMath>
-      <w:r>
-        <w:t xml:space="preserve"> </w:t>
-      </w:r>
-      <w:r>
-        <w:t xml:space="preserve">is</w:t>
-      </w:r>
-      <w:r>
-        <w:t xml:space="preserve"> </w:t>
-      </w:r>
-      <m:oMath>
-        <m:r>
-          <m:rPr>
-            <m:sty m:val="p"/>
-          </m:rPr>
-          <m:t>Re</m:t>
-        </m:r>
-        <m:r>
-          <m:t>z</m:t>
+          <m:rPr>
+            <m:scr m:val="double-struck"/>
+            <m:sty m:val="p"/>
+          </m:rPr>
+          <m:t>C</m:t>
         </m:r>
         <m:limUpp>
           <m:e>
@@ -2803,39 +2765,105 @@
           </m:lim>
         </m:limUpp>
         <m:r>
+          <m:rPr>
+            <m:sty m:val="p"/>
+          </m:rPr>
+          <m:t>{</m:t>
+        </m:r>
+        <m:r>
           <m:t>a</m:t>
         </m:r>
+        <m:r>
+          <m:rPr>
+            <m:sty m:val="p"/>
+          </m:rPr>
+          <m:t>+</m:t>
+        </m:r>
+        <m:r>
+          <m:t>b</m:t>
+        </m:r>
+        <m:r>
+          <m:t> </m:t>
+        </m:r>
+        <m:r>
+          <m:t>i</m:t>
+        </m:r>
+        <m:r>
+          <m:rPr>
+            <m:sty m:val="p"/>
+          </m:rPr>
+          <m:t>:</m:t>
+        </m:r>
+        <m:r>
+          <m:t>a</m:t>
+        </m:r>
+        <m:r>
+          <m:rPr>
+            <m:sty m:val="p"/>
+          </m:rPr>
+          <m:t>,</m:t>
+        </m:r>
+        <m:r>
+          <m:t>b</m:t>
+        </m:r>
+        <m:r>
+          <m:rPr>
+            <m:sty m:val="p"/>
+          </m:rPr>
+          <m:t>∈</m:t>
+        </m:r>
+        <m:r>
+          <m:rPr>
+            <m:scr m:val="double-struck"/>
+            <m:sty m:val="p"/>
+          </m:rPr>
+          <m:t>R</m:t>
+        </m:r>
+        <m:r>
+          <m:rPr>
+            <m:sty m:val="p"/>
+          </m:rPr>
+          <m:t>}</m:t>
+        </m:r>
       </m:oMath>
       <w:r>
         <w:t xml:space="preserve">.</w:t>
       </w:r>
     </w:p>
+    <w:bookmarkEnd w:id="18"/>
+    <w:bookmarkStart w:id="19" w:name="def-real-part"/>
     <w:p>
       <w:pPr>
-        <w:pStyle w:val="Compact"/>
-        <w:numPr>
-          <w:ilvl w:val="0"/>
-          <w:numId w:val="1003"/>
-        </w:numPr>
-      </w:pPr>
-      <w:r>
-        <w:t xml:space="preserve">The</w:t>
-      </w:r>
-      <w:r>
-        <w:t xml:space="preserve"> </w:t>
-      </w:r>
+        <w:pStyle w:val="BodyText"/>
+      </w:pPr>
       <w:r>
         <w:rPr>
           <w:b/>
           <w:bCs/>
         </w:rPr>
-        <w:t xml:space="preserve">imaginary part</w:t>
-      </w:r>
-      <w:r>
-        <w:t xml:space="preserve"> </w:t>
-      </w:r>
-      <w:r>
-        <w:t xml:space="preserve">of</w:t>
+        <w:t xml:space="preserve">Definition 3 (Real part)</w:t>
+      </w:r>
+      <w:r>
+        <w:t xml:space="preserve"> </w:t>
+      </w:r>
+      <w:r>
+        <w:t xml:space="preserve">The</w:t>
+      </w:r>
+      <w:r>
+        <w:t xml:space="preserve"> </w:t>
+      </w:r>
+      <w:r>
+        <w:rPr>
+          <w:b/>
+          <w:bCs/>
+        </w:rPr>
+        <w:t xml:space="preserve">real part</w:t>
+      </w:r>
+      <w:r>
+        <w:t xml:space="preserve"> </w:t>
+      </w:r>
+      <w:r>
+        <w:t xml:space="preserve">of a complex number</w:t>
       </w:r>
       <w:r>
         <w:t xml:space="preserve"> </w:t>
@@ -2844,12 +2872,47 @@
         <m:r>
           <m:t>z</m:t>
         </m:r>
+        <m:r>
+          <m:rPr>
+            <m:sty m:val="p"/>
+          </m:rPr>
+          <m:t>=</m:t>
+        </m:r>
+        <m:r>
+          <m:t>a</m:t>
+        </m:r>
+        <m:r>
+          <m:rPr>
+            <m:sty m:val="p"/>
+          </m:rPr>
+          <m:t>+</m:t>
+        </m:r>
+        <m:r>
+          <m:t>b</m:t>
+        </m:r>
+        <m:r>
+          <m:t> </m:t>
+        </m:r>
+        <m:r>
+          <m:t>i</m:t>
+        </m:r>
       </m:oMath>
       <w:r>
         <w:t xml:space="preserve"> </w:t>
       </w:r>
       <w:r>
-        <w:t xml:space="preserve">is</w:t>
+        <w:t xml:space="preserve">(</w:t>
+      </w:r>
+      <w:hyperlink w:anchor="def-complex-number">
+        <w:r>
+          <w:rPr>
+            <w:rStyle w:val="Hyperlink"/>
+          </w:rPr>
+          <w:t xml:space="preserve">Definition 2</w:t>
+        </w:r>
+      </w:hyperlink>
+      <w:r>
+        <w:t xml:space="preserve">) is</w:t>
       </w:r>
       <w:r>
         <w:t xml:space="preserve"> </w:t>
@@ -2859,7 +2922,7 @@
           <m:rPr>
             <m:sty m:val="p"/>
           </m:rPr>
-          <m:t>Im</m:t>
+          <m:t>Re</m:t>
         </m:r>
         <m:r>
           <m:t>z</m:t>
@@ -2884,23 +2947,96 @@
           </m:lim>
         </m:limUpp>
         <m:r>
+          <m:t>a</m:t>
+        </m:r>
+      </m:oMath>
+      <w:r>
+        <w:t xml:space="preserve">.</w:t>
+      </w:r>
+    </w:p>
+    <w:bookmarkEnd w:id="19"/>
+    <w:bookmarkStart w:id="20" w:name="def-imaginary-part"/>
+    <w:p>
+      <w:pPr>
+        <w:pStyle w:val="BodyText"/>
+      </w:pPr>
+      <w:r>
+        <w:rPr>
+          <w:b/>
+          <w:bCs/>
+        </w:rPr>
+        <w:t xml:space="preserve">Definition 4 (Imaginary part)</w:t>
+      </w:r>
+      <w:r>
+        <w:t xml:space="preserve"> </w:t>
+      </w:r>
+      <w:r>
+        <w:t xml:space="preserve">The</w:t>
+      </w:r>
+      <w:r>
+        <w:t xml:space="preserve"> </w:t>
+      </w:r>
+      <w:r>
+        <w:rPr>
+          <w:b/>
+          <w:bCs/>
+        </w:rPr>
+        <w:t xml:space="preserve">imaginary part</w:t>
+      </w:r>
+      <w:r>
+        <w:t xml:space="preserve"> </w:t>
+      </w:r>
+      <w:r>
+        <w:t xml:space="preserve">of a complex number</w:t>
+      </w:r>
+      <w:r>
+        <w:t xml:space="preserve"> </w:t>
+      </w:r>
+      <m:oMath>
+        <m:r>
+          <m:t>z</m:t>
+        </m:r>
+        <m:r>
+          <m:rPr>
+            <m:sty m:val="p"/>
+          </m:rPr>
+          <m:t>=</m:t>
+        </m:r>
+        <m:r>
+          <m:t>a</m:t>
+        </m:r>
+        <m:r>
+          <m:rPr>
+            <m:sty m:val="p"/>
+          </m:rPr>
+          <m:t>+</m:t>
+        </m:r>
+        <m:r>
           <m:t>b</m:t>
         </m:r>
+        <m:r>
+          <m:t> </m:t>
+        </m:r>
+        <m:r>
+          <m:t>i</m:t>
+        </m:r>
       </m:oMath>
       <w:r>
-        <w:t xml:space="preserve">.</w:t>
-      </w:r>
-    </w:p>
-    <w:p>
-      <w:pPr>
-        <w:pStyle w:val="Compact"/>
-        <w:numPr>
-          <w:ilvl w:val="0"/>
-          <w:numId w:val="1003"/>
-        </w:numPr>
-      </w:pPr>
-      <w:r>
-        <w:t xml:space="preserve">The set of all complex numbers is</w:t>
+        <w:t xml:space="preserve"> </w:t>
+      </w:r>
+      <w:r>
+        <w:t xml:space="preserve">(</w:t>
+      </w:r>
+      <w:hyperlink w:anchor="def-complex-number">
+        <w:r>
+          <w:rPr>
+            <w:rStyle w:val="Hyperlink"/>
+          </w:rPr>
+          <w:t xml:space="preserve">Definition 2</w:t>
+        </w:r>
+      </w:hyperlink>
+      <w:r>
+        <w:t xml:space="preserve">) is</w:t>
       </w:r>
       <w:r>
         <w:t xml:space="preserve"> </w:t>
@@ -2908,10 +3044,12 @@
       <m:oMath>
         <m:r>
           <m:rPr>
-            <m:scr m:val="double-struck"/>
-            <m:sty m:val="p"/>
-          </m:rPr>
-          <m:t>C</m:t>
+            <m:sty m:val="p"/>
+          </m:rPr>
+          <m:t>Im</m:t>
+        </m:r>
+        <m:r>
+          <m:t>z</m:t>
         </m:r>
         <m:limUpp>
           <m:e>
@@ -2933,189 +3071,15 @@
           </m:lim>
         </m:limUpp>
         <m:r>
-          <m:rPr>
-            <m:sty m:val="p"/>
-          </m:rPr>
-          <m:t>{</m:t>
-        </m:r>
-        <m:r>
-          <m:t>a</m:t>
-        </m:r>
-        <m:r>
-          <m:rPr>
-            <m:sty m:val="p"/>
-          </m:rPr>
-          <m:t>+</m:t>
-        </m:r>
-        <m:r>
           <m:t>b</m:t>
         </m:r>
-        <m:r>
-          <m:t> </m:t>
-        </m:r>
-        <m:r>
-          <m:t>i</m:t>
-        </m:r>
-        <m:r>
-          <m:rPr>
-            <m:sty m:val="p"/>
-          </m:rPr>
-          <m:t>:</m:t>
-        </m:r>
-        <m:r>
-          <m:t>a</m:t>
-        </m:r>
-        <m:r>
-          <m:rPr>
-            <m:sty m:val="p"/>
-          </m:rPr>
-          <m:t>,</m:t>
-        </m:r>
-        <m:r>
-          <m:t>b</m:t>
-        </m:r>
-        <m:r>
-          <m:rPr>
-            <m:sty m:val="p"/>
-          </m:rPr>
-          <m:t>∈</m:t>
-        </m:r>
-        <m:r>
-          <m:rPr>
-            <m:scr m:val="double-struck"/>
-            <m:sty m:val="p"/>
-          </m:rPr>
-          <m:t>R</m:t>
-        </m:r>
-        <m:r>
-          <m:rPr>
-            <m:sty m:val="p"/>
-          </m:rPr>
-          <m:t>}</m:t>
-        </m:r>
       </m:oMath>
       <w:r>
         <w:t xml:space="preserve">.</w:t>
       </w:r>
     </w:p>
-    <w:p>
-      <w:pPr>
-        <w:pStyle w:val="FirstParagraph"/>
-      </w:pPr>
-      <w:r>
-        <w:t xml:space="preserve">Two complex numbers are equal exactly when their real parts are equal and their imaginary parts are equal.</w:t>
-      </w:r>
-    </w:p>
-    <w:bookmarkEnd w:id="18"/>
-    <w:p>
-      <w:pPr>
-        <w:pStyle w:val="BodyText"/>
-      </w:pPr>
-      <w:r>
-        <w:t xml:space="preserve">Axler (2024, Definition 1.1, p. 2)</w:t>
-      </w:r>
-      <w:r>
-        <w:t xml:space="preserve"> </w:t>
-      </w:r>
-      <w:r>
-        <w:t xml:space="preserve">defines</w:t>
-      </w:r>
-      <w:r>
-        <w:t xml:space="preserve"> </w:t>
-      </w:r>
-      <m:oMath>
-        <m:r>
-          <m:rPr>
-            <m:scr m:val="double-struck"/>
-            <m:sty m:val="p"/>
-          </m:rPr>
-          <m:t>C</m:t>
-        </m:r>
-      </m:oMath>
-      <w:r>
-        <w:t xml:space="preserve"> </w:t>
-      </w:r>
-      <w:r>
-        <w:t xml:space="preserve">as the set of ordered pairs</w:t>
-      </w:r>
-      <w:r>
-        <w:t xml:space="preserve"> </w:t>
-      </w:r>
-      <m:oMath>
-        <m:r>
-          <m:rPr>
-            <m:sty m:val="p"/>
-          </m:rPr>
-          <m:t>(</m:t>
-        </m:r>
-        <m:r>
-          <m:t>a</m:t>
-        </m:r>
-        <m:r>
-          <m:rPr>
-            <m:sty m:val="p"/>
-          </m:rPr>
-          <m:t>,</m:t>
-        </m:r>
-        <m:r>
-          <m:t>b</m:t>
-        </m:r>
-        <m:r>
-          <m:rPr>
-            <m:sty m:val="p"/>
-          </m:rPr>
-          <m:t>)</m:t>
-        </m:r>
-      </m:oMath>
-      <w:r>
-        <w:t xml:space="preserve"> </w:t>
-      </w:r>
-      <w:r>
-        <w:t xml:space="preserve">of real numbers, written</w:t>
-      </w:r>
-      <w:r>
-        <w:t xml:space="preserve"> </w:t>
-      </w:r>
-      <m:oMath>
-        <m:r>
-          <m:t>a</m:t>
-        </m:r>
-        <m:r>
-          <m:rPr>
-            <m:sty m:val="p"/>
-          </m:rPr>
-          <m:t>+</m:t>
-        </m:r>
-        <m:r>
-          <m:t>b</m:t>
-        </m:r>
-        <m:r>
-          <m:t>i</m:t>
-        </m:r>
-      </m:oMath>
-      <w:r>
-        <w:t xml:space="preserve">,</w:t>
-      </w:r>
-      <w:r>
-        <w:t xml:space="preserve"> </w:t>
-      </w:r>
-      <w:r>
-        <w:t xml:space="preserve">and</w:t>
-      </w:r>
-      <w:r>
-        <w:t xml:space="preserve"> </w:t>
-      </w:r>
-      <w:r>
-        <w:t xml:space="preserve">Axler (2024, Definition 4.1, p. 120)</w:t>
-      </w:r>
-      <w:r>
-        <w:t xml:space="preserve"> </w:t>
-      </w:r>
-      <w:r>
-        <w:t xml:space="preserve">defines the real and imaginary parts.</w:t>
-      </w:r>
-    </w:p>
-    <w:bookmarkStart w:id="19" w:name="exm-complex-number"/>
+    <w:bookmarkEnd w:id="20"/>
+    <w:bookmarkStart w:id="21" w:name="def-complex-equality"/>
     <w:p>
       <w:pPr>
         <w:pStyle w:val="BodyText"/>
@@ -3125,855 +3089,13 @@
           <w:b/>
           <w:bCs/>
         </w:rPr>
-        <w:t xml:space="preserve">Example 4 (Real and imaginary parts)</w:t>
-      </w:r>
-      <w:r>
-        <w:t xml:space="preserve"> </w:t>
-      </w:r>
-      <w:r>
-        <w:t xml:space="preserve">For</w:t>
-      </w:r>
-      <w:r>
-        <w:t xml:space="preserve"> </w:t>
-      </w:r>
-      <m:oMath>
-        <m:r>
-          <m:t>z</m:t>
-        </m:r>
-        <m:r>
-          <m:rPr>
-            <m:sty m:val="p"/>
-          </m:rPr>
-          <m:t>=</m:t>
-        </m:r>
-        <m:r>
-          <m:t>2</m:t>
-        </m:r>
-        <m:r>
-          <m:rPr>
-            <m:sty m:val="p"/>
-          </m:rPr>
-          <m:t>−</m:t>
-        </m:r>
-        <m:r>
-          <m:t>5</m:t>
-        </m:r>
-        <m:r>
-          <m:t> </m:t>
-        </m:r>
-        <m:r>
-          <m:t>i</m:t>
-        </m:r>
-      </m:oMath>
-      <w:r>
-        <w:t xml:space="preserve">, the real part is</w:t>
-      </w:r>
-      <w:r>
-        <w:t xml:space="preserve"> </w:t>
-      </w:r>
-      <m:oMath>
-        <m:r>
-          <m:rPr>
-            <m:sty m:val="p"/>
-          </m:rPr>
-          <m:t>Re</m:t>
-        </m:r>
-        <m:r>
-          <m:t>z</m:t>
-        </m:r>
-        <m:r>
-          <m:rPr>
-            <m:sty m:val="p"/>
-          </m:rPr>
-          <m:t>=</m:t>
-        </m:r>
-        <m:r>
-          <m:t>2</m:t>
-        </m:r>
-      </m:oMath>
-      <w:r>
-        <w:t xml:space="preserve"> </w:t>
-      </w:r>
-      <w:r>
-        <w:t xml:space="preserve">and the imaginary part is</w:t>
-      </w:r>
-      <w:r>
-        <w:t xml:space="preserve"> </w:t>
-      </w:r>
-      <m:oMath>
-        <m:r>
-          <m:rPr>
-            <m:sty m:val="p"/>
-          </m:rPr>
-          <m:t>Im</m:t>
-        </m:r>
-        <m:r>
-          <m:t>z</m:t>
-        </m:r>
-        <m:r>
-          <m:rPr>
-            <m:sty m:val="p"/>
-          </m:rPr>
-          <m:t>=</m:t>
-        </m:r>
-        <m:r>
-          <m:rPr>
-            <m:sty m:val="p"/>
-          </m:rPr>
-          <m:t>−</m:t>
-        </m:r>
-        <m:r>
-          <m:t>5</m:t>
-        </m:r>
-      </m:oMath>
-      <w:r>
-        <w:t xml:space="preserve">:</w:t>
-      </w:r>
-      <w:r>
-        <w:t xml:space="preserve"> </w:t>
-      </w:r>
-      <w:r>
-        <w:t xml:space="preserve">the imaginary part is the real number</w:t>
-      </w:r>
-      <w:r>
-        <w:t xml:space="preserve"> </w:t>
-      </w:r>
-      <m:oMath>
-        <m:r>
-          <m:rPr>
-            <m:sty m:val="p"/>
-          </m:rPr>
-          <m:t>−</m:t>
-        </m:r>
-        <m:r>
-          <m:t>5</m:t>
-        </m:r>
-      </m:oMath>
-      <w:r>
-        <w:t xml:space="preserve">, not</w:t>
-      </w:r>
-      <w:r>
-        <w:t xml:space="preserve"> </w:t>
-      </w:r>
-      <m:oMath>
-        <m:r>
-          <m:rPr>
-            <m:sty m:val="p"/>
-          </m:rPr>
-          <m:t>−</m:t>
-        </m:r>
-        <m:r>
-          <m:t>5</m:t>
-        </m:r>
-        <m:r>
-          <m:t> </m:t>
-        </m:r>
-        <m:r>
-          <m:t>i</m:t>
-        </m:r>
-      </m:oMath>
-      <w:r>
-        <w:t xml:space="preserve">.</w:t>
-      </w:r>
-    </w:p>
-    <w:p>
-      <w:pPr>
-        <w:pStyle w:val="BodyText"/>
-      </w:pPr>
-      <w:r>
-        <w:t xml:space="preserve">The numbers</w:t>
-      </w:r>
-      <w:r>
-        <w:t xml:space="preserve"> </w:t>
-      </w:r>
-      <m:oMath>
-        <m:r>
-          <m:t>1</m:t>
-        </m:r>
-        <m:r>
-          <m:rPr>
-            <m:sty m:val="p"/>
-          </m:rPr>
-          <m:t>+</m:t>
-        </m:r>
-        <m:r>
-          <m:t>i</m:t>
-        </m:r>
-      </m:oMath>
-      <w:r>
-        <w:t xml:space="preserve"> </w:t>
-      </w:r>
-      <w:r>
-        <w:t xml:space="preserve">and</w:t>
-      </w:r>
-      <w:r>
-        <w:t xml:space="preserve"> </w:t>
-      </w:r>
-      <m:oMath>
-        <m:r>
-          <m:t>1</m:t>
-        </m:r>
-        <m:r>
-          <m:rPr>
-            <m:sty m:val="p"/>
-          </m:rPr>
-          <m:t>−</m:t>
-        </m:r>
-        <m:r>
-          <m:t>i</m:t>
-        </m:r>
-      </m:oMath>
-      <w:r>
-        <w:t xml:space="preserve"> </w:t>
-      </w:r>
-      <w:r>
-        <w:t xml:space="preserve">have the same real part,</w:t>
-      </w:r>
-      <w:r>
-        <w:t xml:space="preserve"> </w:t>
-      </w:r>
-      <m:oMath>
-        <m:r>
-          <m:t>1</m:t>
-        </m:r>
-      </m:oMath>
-      <w:r>
-        <w:t xml:space="preserve">,</w:t>
-      </w:r>
-      <w:r>
-        <w:t xml:space="preserve"> </w:t>
-      </w:r>
-      <w:r>
-        <w:t xml:space="preserve">but different imaginary parts,</w:t>
-      </w:r>
-      <w:r>
-        <w:t xml:space="preserve"> </w:t>
-      </w:r>
-      <m:oMath>
-        <m:r>
-          <m:t>1</m:t>
-        </m:r>
-      </m:oMath>
-      <w:r>
-        <w:t xml:space="preserve"> </w:t>
-      </w:r>
-      <w:r>
-        <w:t xml:space="preserve">and</w:t>
-      </w:r>
-      <w:r>
-        <w:t xml:space="preserve"> </w:t>
-      </w:r>
-      <m:oMath>
-        <m:r>
-          <m:rPr>
-            <m:sty m:val="p"/>
-          </m:rPr>
-          <m:t>−</m:t>
-        </m:r>
-        <m:r>
-          <m:t>1</m:t>
-        </m:r>
-      </m:oMath>
-      <w:r>
-        <w:t xml:space="preserve">,</w:t>
-      </w:r>
-      <w:r>
-        <w:t xml:space="preserve"> </w:t>
-      </w:r>
-      <w:r>
-        <w:t xml:space="preserve">so they are different complex numbers.</w:t>
-      </w:r>
-    </w:p>
-    <w:p>
-      <w:pPr>
-        <w:pStyle w:val="BodyText"/>
-      </w:pPr>
-      <w:r>
-        <w:t xml:space="preserve">The real number</w:t>
-      </w:r>
-      <w:r>
-        <w:t xml:space="preserve"> </w:t>
-      </w:r>
-      <m:oMath>
-        <m:r>
-          <m:t>7</m:t>
-        </m:r>
-      </m:oMath>
-      <w:r>
-        <w:t xml:space="preserve"> </w:t>
-      </w:r>
-      <w:r>
-        <w:t xml:space="preserve">is the complex number</w:t>
-      </w:r>
-      <w:r>
-        <w:t xml:space="preserve"> </w:t>
-      </w:r>
-      <m:oMath>
-        <m:r>
-          <m:t>7</m:t>
-        </m:r>
-        <m:r>
-          <m:rPr>
-            <m:sty m:val="p"/>
-          </m:rPr>
-          <m:t>+</m:t>
-        </m:r>
-        <m:r>
-          <m:t>0</m:t>
-        </m:r>
-        <m:r>
-          <m:t> </m:t>
-        </m:r>
-        <m:r>
-          <m:t>i</m:t>
-        </m:r>
-      </m:oMath>
-      <w:r>
-        <w:t xml:space="preserve">,</w:t>
-      </w:r>
-      <w:r>
-        <w:t xml:space="preserve"> </w:t>
-      </w:r>
-      <w:r>
-        <w:t xml:space="preserve">with real part</w:t>
-      </w:r>
-      <w:r>
-        <w:t xml:space="preserve"> </w:t>
-      </w:r>
-      <m:oMath>
-        <m:r>
-          <m:t>7</m:t>
-        </m:r>
-      </m:oMath>
-      <w:r>
-        <w:t xml:space="preserve"> </w:t>
-      </w:r>
-      <w:r>
-        <w:t xml:space="preserve">and imaginary part</w:t>
-      </w:r>
-      <w:r>
-        <w:t xml:space="preserve"> </w:t>
-      </w:r>
-      <m:oMath>
-        <m:r>
-          <m:t>0</m:t>
-        </m:r>
-      </m:oMath>
-      <w:r>
-        <w:t xml:space="preserve">.</w:t>
-      </w:r>
-    </w:p>
-    <w:bookmarkEnd w:id="19"/>
-    <w:bookmarkStart w:id="20" w:name="thm-reals-in-complex"/>
-    <w:p>
-      <w:pPr>
-        <w:pStyle w:val="BodyText"/>
-      </w:pPr>
-      <w:r>
-        <w:rPr>
-          <w:b/>
-          <w:bCs/>
-        </w:rPr>
-        <w:t xml:space="preserve">Theorem 2 (Every real number is a complex number)</w:t>
-      </w:r>
-      <w:r>
-        <w:t xml:space="preserve"> </w:t>
-      </w:r>
-      <w:r>
-        <w:t xml:space="preserve">A complex number</w:t>
-      </w:r>
-      <w:r>
-        <w:t xml:space="preserve"> </w:t>
-      </w:r>
-      <m:oMath>
-        <m:r>
-          <m:t>z</m:t>
-        </m:r>
-      </m:oMath>
-      <w:r>
-        <w:t xml:space="preserve"> </w:t>
-      </w:r>
-      <w:r>
-        <w:t xml:space="preserve">is a real number exactly when</w:t>
-      </w:r>
-      <w:r>
-        <w:t xml:space="preserve"> </w:t>
-      </w:r>
-      <m:oMath>
-        <m:r>
-          <m:rPr>
-            <m:sty m:val="p"/>
-          </m:rPr>
-          <m:t>Im</m:t>
-        </m:r>
-        <m:r>
-          <m:t>z</m:t>
-        </m:r>
-        <m:r>
-          <m:rPr>
-            <m:sty m:val="p"/>
-          </m:rPr>
-          <m:t>=</m:t>
-        </m:r>
-        <m:r>
-          <m:t>0</m:t>
-        </m:r>
-      </m:oMath>
-      <w:r>
-        <w:t xml:space="preserve">.</w:t>
-      </w:r>
-      <w:r>
-        <w:t xml:space="preserve"> </w:t>
-      </w:r>
-      <w:r>
-        <w:t xml:space="preserve">In particular, every real number</w:t>
-      </w:r>
-      <w:r>
-        <w:t xml:space="preserve"> </w:t>
-      </w:r>
-      <m:oMath>
-        <m:r>
-          <m:t>a</m:t>
-        </m:r>
-      </m:oMath>
-      <w:r>
-        <w:t xml:space="preserve"> </w:t>
-      </w:r>
-      <w:r>
-        <w:t xml:space="preserve">is the complex number</w:t>
-      </w:r>
-      <w:r>
-        <w:t xml:space="preserve"> </w:t>
-      </w:r>
-      <m:oMath>
-        <m:r>
-          <m:t>a</m:t>
-        </m:r>
-        <m:r>
-          <m:rPr>
-            <m:sty m:val="p"/>
-          </m:rPr>
-          <m:t>+</m:t>
-        </m:r>
-        <m:r>
-          <m:t>0</m:t>
-        </m:r>
-        <m:r>
-          <m:t> </m:t>
-        </m:r>
-        <m:r>
-          <m:t>i</m:t>
-        </m:r>
-      </m:oMath>
-      <w:r>
-        <w:t xml:space="preserve">,</w:t>
-      </w:r>
-      <w:r>
-        <w:t xml:space="preserve"> </w:t>
-      </w:r>
-      <w:r>
-        <w:t xml:space="preserve">with</w:t>
-      </w:r>
-      <w:r>
-        <w:t xml:space="preserve"> </w:t>
-      </w:r>
-      <m:oMath>
-        <m:r>
-          <m:rPr>
-            <m:sty m:val="p"/>
-          </m:rPr>
-          <m:t>Re</m:t>
-        </m:r>
-        <m:r>
-          <m:t>a</m:t>
-        </m:r>
-        <m:r>
-          <m:rPr>
-            <m:sty m:val="p"/>
-          </m:rPr>
-          <m:t>=</m:t>
-        </m:r>
-        <m:r>
-          <m:t>a</m:t>
-        </m:r>
-      </m:oMath>
-      <w:r>
-        <w:t xml:space="preserve"> </w:t>
-      </w:r>
-      <w:r>
-        <w:t xml:space="preserve">and</w:t>
-      </w:r>
-      <w:r>
-        <w:t xml:space="preserve"> </w:t>
-      </w:r>
-      <m:oMath>
-        <m:r>
-          <m:rPr>
-            <m:sty m:val="p"/>
-          </m:rPr>
-          <m:t>Im</m:t>
-        </m:r>
-        <m:r>
-          <m:t>a</m:t>
-        </m:r>
-        <m:r>
-          <m:rPr>
-            <m:sty m:val="p"/>
-          </m:rPr>
-          <m:t>=</m:t>
-        </m:r>
-        <m:r>
-          <m:t>0</m:t>
-        </m:r>
-      </m:oMath>
-      <w:r>
-        <w:t xml:space="preserve">,</w:t>
-      </w:r>
-      <w:r>
-        <w:t xml:space="preserve"> </w:t>
-      </w:r>
-      <w:r>
-        <w:t xml:space="preserve">so</w:t>
-      </w:r>
-      <w:r>
-        <w:t xml:space="preserve"> </w:t>
-      </w:r>
-      <m:oMath>
-        <m:r>
-          <m:rPr>
-            <m:scr m:val="double-struck"/>
-            <m:sty m:val="p"/>
-          </m:rPr>
-          <m:t>R</m:t>
-        </m:r>
-      </m:oMath>
-      <w:r>
-        <w:t xml:space="preserve"> </w:t>
-      </w:r>
-      <w:r>
-        <w:t xml:space="preserve">is a subset of</w:t>
-      </w:r>
-      <w:r>
-        <w:t xml:space="preserve"> </w:t>
-      </w:r>
-      <m:oMath>
-        <m:r>
-          <m:rPr>
-            <m:scr m:val="double-struck"/>
-            <m:sty m:val="p"/>
-          </m:rPr>
-          <m:t>C</m:t>
-        </m:r>
-      </m:oMath>
-      <w:r>
-        <w:t xml:space="preserve">.</w:t>
-      </w:r>
-    </w:p>
-    <w:bookmarkEnd w:id="20"/>
-    <w:p>
-      <w:pPr>
-        <w:pStyle w:val="BodyText"/>
-      </w:pPr>
-      <w:r>
-        <w:rPr>
-          <w:i/>
-          <w:iCs/>
-        </w:rPr>
-        <w:t xml:space="preserve">Proof</w:t>
-      </w:r>
-      <w:r>
-        <w:t xml:space="preserve">. </w:t>
-      </w:r>
-      <w:r>
-        <w:t xml:space="preserve">Let</w:t>
-      </w:r>
-      <w:r>
-        <w:t xml:space="preserve"> </w:t>
-      </w:r>
-      <m:oMath>
-        <m:r>
-          <m:t>a</m:t>
-        </m:r>
-      </m:oMath>
-      <w:r>
-        <w:t xml:space="preserve"> </w:t>
-      </w:r>
-      <w:r>
-        <w:t xml:space="preserve">be a real number.</w:t>
-      </w:r>
-      <w:r>
-        <w:t xml:space="preserve"> </w:t>
-      </w:r>
-      <w:r>
-        <w:t xml:space="preserve">Since</w:t>
-      </w:r>
-      <w:r>
-        <w:t xml:space="preserve"> </w:t>
-      </w:r>
-      <m:oMath>
-        <m:r>
-          <m:t>0</m:t>
-        </m:r>
-        <m:r>
-          <m:t> </m:t>
-        </m:r>
-        <m:r>
-          <m:t>i</m:t>
-        </m:r>
-        <m:r>
-          <m:rPr>
-            <m:sty m:val="p"/>
-          </m:rPr>
-          <m:t>=</m:t>
-        </m:r>
-        <m:r>
-          <m:t>0</m:t>
-        </m:r>
-      </m:oMath>
-      <w:r>
-        <w:t xml:space="preserve">,</w:t>
-      </w:r>
-    </w:p>
-    <w:p>
-      <w:pPr>
-        <w:pStyle w:val="BodyText"/>
-      </w:pPr>
-      <m:oMathPara>
-        <m:oMathParaPr>
-          <m:jc m:val="center"/>
-        </m:oMathParaPr>
-        <m:oMath>
-          <m:eqArr>
-            <m:e>
-              <m:r>
-                <m:t>a</m:t>
-              </m:r>
-              <m:r>
-                <m:rPr>
-                  <m:sty m:val="p"/>
-                </m:rPr>
-                <m:t>+</m:t>
-              </m:r>
-              <m:r>
-                <m:t>0</m:t>
-              </m:r>
-              <m:r>
-                <m:t> </m:t>
-              </m:r>
-              <m:r>
-                <m:t>i</m:t>
-              </m:r>
-              <m:r>
-                <m:t>&amp;</m:t>
-              </m:r>
-              <m:r>
-                <m:rPr>
-                  <m:sty m:val="p"/>
-                </m:rPr>
-                <m:t>=</m:t>
-              </m:r>
-              <m:r>
-                <m:t>a</m:t>
-              </m:r>
-              <m:r>
-                <m:rPr>
-                  <m:sty m:val="p"/>
-                </m:rPr>
-                <m:t>+</m:t>
-              </m:r>
-              <m:r>
-                <m:t>0</m:t>
-              </m:r>
-              <m:r>
-                <m:t>&amp;</m:t>
-              </m:r>
-              <m:r>
-                <m:t>&amp;</m:t>
-              </m:r>
-              <m:r>
-                <m:rPr>
-                  <m:nor/>
-                  <m:sty m:val="p"/>
-                </m:rPr>
-                <m:t>(</m:t>
-              </m:r>
-              <m:r>
-                <m:t>0</m:t>
-              </m:r>
-              <m:r>
-                <m:t> </m:t>
-              </m:r>
-              <m:r>
-                <m:t>i</m:t>
-              </m:r>
-              <m:r>
-                <m:rPr>
-                  <m:sty m:val="p"/>
-                </m:rPr>
-                <m:t>=</m:t>
-              </m:r>
-              <m:r>
-                <m:t>0</m:t>
-              </m:r>
-              <m:r>
-                <m:rPr>
-                  <m:nor/>
-                  <m:sty m:val="p"/>
-                </m:rPr>
-                <m:t>)</m:t>
-              </m:r>
-            </m:e>
-            <m:e>
-              <m:r>
-                <m:t>&amp;</m:t>
-              </m:r>
-              <m:r>
-                <m:rPr>
-                  <m:sty m:val="p"/>
-                </m:rPr>
-                <m:t>=</m:t>
-              </m:r>
-              <m:r>
-                <m:t>a</m:t>
-              </m:r>
-              <m:r>
-                <m:t>&amp;</m:t>
-              </m:r>
-              <m:r>
-                <m:t>&amp;</m:t>
-              </m:r>
-              <m:r>
-                <m:rPr>
-                  <m:nor/>
-                  <m:sty m:val="p"/>
-                </m:rPr>
-                <m:t>(</m:t>
-              </m:r>
-              <m:r>
-                <m:rPr>
-                  <m:nor/>
-                  <m:sty m:val="p"/>
-                </m:rPr>
-                <m:t>Theorem 4 in Convexity, Infimum and Sums</m:t>
-              </m:r>
-              <m:r>
-                <m:rPr>
-                  <m:nor/>
-                  <m:sty m:val="p"/>
-                </m:rPr>
-                <m:t>)</m:t>
-              </m:r>
-            </m:e>
-          </m:eqArr>
-        </m:oMath>
-      </m:oMathPara>
-    </w:p>
-    <w:p>
-      <w:pPr>
-        <w:pStyle w:val="FirstParagraph"/>
-      </w:pPr>
-      <w:r>
-        <w:t xml:space="preserve">so</w:t>
-      </w:r>
-      <w:r>
-        <w:t xml:space="preserve"> </w:t>
-      </w:r>
-      <m:oMath>
-        <m:r>
-          <m:t>a</m:t>
-        </m:r>
-      </m:oMath>
-      <w:r>
-        <w:t xml:space="preserve"> </w:t>
-      </w:r>
-      <w:r>
-        <w:t xml:space="preserve">is the complex number</w:t>
-      </w:r>
-      <w:r>
-        <w:t xml:space="preserve"> </w:t>
-      </w:r>
-      <m:oMath>
-        <m:r>
-          <m:t>a</m:t>
-        </m:r>
-        <m:r>
-          <m:rPr>
-            <m:sty m:val="p"/>
-          </m:rPr>
-          <m:t>+</m:t>
-        </m:r>
-        <m:r>
-          <m:t>0</m:t>
-        </m:r>
-        <m:r>
-          <m:t> </m:t>
-        </m:r>
-        <m:r>
-          <m:t>i</m:t>
-        </m:r>
-      </m:oMath>
-      <w:r>
-        <w:t xml:space="preserve">, whose imaginary part is</w:t>
-      </w:r>
-      <w:r>
-        <w:t xml:space="preserve"> </w:t>
-      </w:r>
-      <m:oMath>
-        <m:r>
-          <m:t>0</m:t>
-        </m:r>
-      </m:oMath>
-      <w:r>
-        <w:t xml:space="preserve">.</w:t>
-      </w:r>
-      <w:r>
-        <w:t xml:space="preserve"> </w:t>
-      </w:r>
-      <w:r>
-        <w:t xml:space="preserve">The real part of</w:t>
-      </w:r>
-      <w:r>
-        <w:t xml:space="preserve"> </w:t>
-      </w:r>
-      <m:oMath>
-        <m:r>
-          <m:t>a</m:t>
-        </m:r>
-        <m:r>
-          <m:rPr>
-            <m:sty m:val="p"/>
-          </m:rPr>
-          <m:t>+</m:t>
-        </m:r>
-        <m:r>
-          <m:t>0</m:t>
-        </m:r>
-        <m:r>
-          <m:t> </m:t>
-        </m:r>
-        <m:r>
-          <m:t>i</m:t>
-        </m:r>
-      </m:oMath>
-      <w:r>
-        <w:t xml:space="preserve"> </w:t>
-      </w:r>
-      <w:r>
-        <w:t xml:space="preserve">is</w:t>
-      </w:r>
-      <w:r>
-        <w:t xml:space="preserve"> </w:t>
-      </w:r>
-      <m:oMath>
-        <m:r>
-          <m:t>a</m:t>
-        </m:r>
-      </m:oMath>
-      <w:r>
-        <w:t xml:space="preserve">, and by the equality rule in</w:t>
-      </w:r>
-      <w:r>
-        <w:t xml:space="preserve"> </w:t>
+        <w:t xml:space="preserve">Definition 5 (Equal complex numbers)</w:t>
+      </w:r>
+      <w:r>
+        <w:t xml:space="preserve"> </w:t>
+      </w:r>
+      <w:r>
+        <w:t xml:space="preserve">Two complex numbers (</w:t>
       </w:r>
       <w:hyperlink w:anchor="def-complex-number">
         <w:r>
@@ -3984,10 +3106,315 @@
         </w:r>
       </w:hyperlink>
       <w:r>
-        <w:t xml:space="preserve"> </w:t>
-      </w:r>
-      <w:r>
-        <w:t xml:space="preserve">no other pair of real and imaginary parts gives the same number.</w:t>
+        <w:t xml:space="preserve">) are</w:t>
+      </w:r>
+      <w:r>
+        <w:t xml:space="preserve"> </w:t>
+      </w:r>
+      <w:r>
+        <w:rPr>
+          <w:b/>
+          <w:bCs/>
+        </w:rPr>
+        <w:t xml:space="preserve">equal</w:t>
+      </w:r>
+      <w:r>
+        <w:t xml:space="preserve"> </w:t>
+      </w:r>
+      <w:r>
+        <w:t xml:space="preserve">exactly when their real parts (</w:t>
+      </w:r>
+      <w:hyperlink w:anchor="def-real-part">
+        <w:r>
+          <w:rPr>
+            <w:rStyle w:val="Hyperlink"/>
+          </w:rPr>
+          <w:t xml:space="preserve">Definition 3</w:t>
+        </w:r>
+      </w:hyperlink>
+      <w:r>
+        <w:t xml:space="preserve">) are equal and their imaginary parts (</w:t>
+      </w:r>
+      <w:hyperlink w:anchor="def-imaginary-part">
+        <w:r>
+          <w:rPr>
+            <w:rStyle w:val="Hyperlink"/>
+          </w:rPr>
+          <w:t xml:space="preserve">Definition 4</w:t>
+        </w:r>
+      </w:hyperlink>
+      <w:r>
+        <w:t xml:space="preserve">) are equal.</w:t>
+      </w:r>
+    </w:p>
+    <w:bookmarkEnd w:id="21"/>
+    <w:p>
+      <w:pPr>
+        <w:pStyle w:val="BodyText"/>
+      </w:pPr>
+      <w:r>
+        <w:t xml:space="preserve">Axler (2024, Definition 1.1, p. 2)</w:t>
+      </w:r>
+      <w:r>
+        <w:t xml:space="preserve"> </w:t>
+      </w:r>
+      <w:r>
+        <w:t xml:space="preserve">defines</w:t>
+      </w:r>
+      <w:r>
+        <w:t xml:space="preserve"> </w:t>
+      </w:r>
+      <m:oMath>
+        <m:r>
+          <m:rPr>
+            <m:scr m:val="double-struck"/>
+            <m:sty m:val="p"/>
+          </m:rPr>
+          <m:t>C</m:t>
+        </m:r>
+      </m:oMath>
+      <w:r>
+        <w:t xml:space="preserve"> </w:t>
+      </w:r>
+      <w:r>
+        <w:t xml:space="preserve">as the set of ordered pairs</w:t>
+      </w:r>
+      <w:r>
+        <w:t xml:space="preserve"> </w:t>
+      </w:r>
+      <m:oMath>
+        <m:r>
+          <m:rPr>
+            <m:sty m:val="p"/>
+          </m:rPr>
+          <m:t>(</m:t>
+        </m:r>
+        <m:r>
+          <m:t>a</m:t>
+        </m:r>
+        <m:r>
+          <m:rPr>
+            <m:sty m:val="p"/>
+          </m:rPr>
+          <m:t>,</m:t>
+        </m:r>
+        <m:r>
+          <m:t>b</m:t>
+        </m:r>
+        <m:r>
+          <m:rPr>
+            <m:sty m:val="p"/>
+          </m:rPr>
+          <m:t>)</m:t>
+        </m:r>
+      </m:oMath>
+      <w:r>
+        <w:t xml:space="preserve"> </w:t>
+      </w:r>
+      <w:r>
+        <w:t xml:space="preserve">of real numbers, written</w:t>
+      </w:r>
+      <w:r>
+        <w:t xml:space="preserve"> </w:t>
+      </w:r>
+      <m:oMath>
+        <m:r>
+          <m:t>a</m:t>
+        </m:r>
+        <m:r>
+          <m:rPr>
+            <m:sty m:val="p"/>
+          </m:rPr>
+          <m:t>+</m:t>
+        </m:r>
+        <m:r>
+          <m:t>b</m:t>
+        </m:r>
+        <m:r>
+          <m:t>i</m:t>
+        </m:r>
+      </m:oMath>
+      <w:r>
+        <w:t xml:space="preserve">,</w:t>
+      </w:r>
+      <w:r>
+        <w:t xml:space="preserve"> </w:t>
+      </w:r>
+      <w:r>
+        <w:t xml:space="preserve">and</w:t>
+      </w:r>
+      <w:r>
+        <w:t xml:space="preserve"> </w:t>
+      </w:r>
+      <w:r>
+        <w:t xml:space="preserve">Axler (2024, Definition 4.1, p. 120)</w:t>
+      </w:r>
+      <w:r>
+        <w:t xml:space="preserve"> </w:t>
+      </w:r>
+      <w:r>
+        <w:t xml:space="preserve">defines the real and imaginary parts.</w:t>
+      </w:r>
+    </w:p>
+    <w:bookmarkStart w:id="22" w:name="exm-complex-number"/>
+    <w:p>
+      <w:pPr>
+        <w:pStyle w:val="BodyText"/>
+      </w:pPr>
+      <w:r>
+        <w:rPr>
+          <w:b/>
+          <w:bCs/>
+        </w:rPr>
+        <w:t xml:space="preserve">Example 4 (Real and imaginary parts)</w:t>
+      </w:r>
+      <w:r>
+        <w:t xml:space="preserve"> </w:t>
+      </w:r>
+      <w:r>
+        <w:t xml:space="preserve">For</w:t>
+      </w:r>
+      <w:r>
+        <w:t xml:space="preserve"> </w:t>
+      </w:r>
+      <m:oMath>
+        <m:r>
+          <m:t>z</m:t>
+        </m:r>
+        <m:r>
+          <m:rPr>
+            <m:sty m:val="p"/>
+          </m:rPr>
+          <m:t>=</m:t>
+        </m:r>
+        <m:r>
+          <m:t>2</m:t>
+        </m:r>
+        <m:r>
+          <m:rPr>
+            <m:sty m:val="p"/>
+          </m:rPr>
+          <m:t>−</m:t>
+        </m:r>
+        <m:r>
+          <m:t>5</m:t>
+        </m:r>
+        <m:r>
+          <m:t> </m:t>
+        </m:r>
+        <m:r>
+          <m:t>i</m:t>
+        </m:r>
+      </m:oMath>
+      <w:r>
+        <w:t xml:space="preserve">, the real part is</w:t>
+      </w:r>
+      <w:r>
+        <w:t xml:space="preserve"> </w:t>
+      </w:r>
+      <m:oMath>
+        <m:r>
+          <m:rPr>
+            <m:sty m:val="p"/>
+          </m:rPr>
+          <m:t>Re</m:t>
+        </m:r>
+        <m:r>
+          <m:t>z</m:t>
+        </m:r>
+        <m:r>
+          <m:rPr>
+            <m:sty m:val="p"/>
+          </m:rPr>
+          <m:t>=</m:t>
+        </m:r>
+        <m:r>
+          <m:t>2</m:t>
+        </m:r>
+      </m:oMath>
+      <w:r>
+        <w:t xml:space="preserve"> </w:t>
+      </w:r>
+      <w:r>
+        <w:t xml:space="preserve">and the imaginary part is</w:t>
+      </w:r>
+      <w:r>
+        <w:t xml:space="preserve"> </w:t>
+      </w:r>
+      <m:oMath>
+        <m:r>
+          <m:rPr>
+            <m:sty m:val="p"/>
+          </m:rPr>
+          <m:t>Im</m:t>
+        </m:r>
+        <m:r>
+          <m:t>z</m:t>
+        </m:r>
+        <m:r>
+          <m:rPr>
+            <m:sty m:val="p"/>
+          </m:rPr>
+          <m:t>=</m:t>
+        </m:r>
+        <m:r>
+          <m:rPr>
+            <m:sty m:val="p"/>
+          </m:rPr>
+          <m:t>−</m:t>
+        </m:r>
+        <m:r>
+          <m:t>5</m:t>
+        </m:r>
+      </m:oMath>
+      <w:r>
+        <w:t xml:space="preserve">:</w:t>
+      </w:r>
+      <w:r>
+        <w:t xml:space="preserve"> </w:t>
+      </w:r>
+      <w:r>
+        <w:t xml:space="preserve">the imaginary part is the real number</w:t>
+      </w:r>
+      <w:r>
+        <w:t xml:space="preserve"> </w:t>
+      </w:r>
+      <m:oMath>
+        <m:r>
+          <m:rPr>
+            <m:sty m:val="p"/>
+          </m:rPr>
+          <m:t>−</m:t>
+        </m:r>
+        <m:r>
+          <m:t>5</m:t>
+        </m:r>
+      </m:oMath>
+      <w:r>
+        <w:t xml:space="preserve">, not</w:t>
+      </w:r>
+      <w:r>
+        <w:t xml:space="preserve"> </w:t>
+      </w:r>
+      <m:oMath>
+        <m:r>
+          <m:rPr>
+            <m:sty m:val="p"/>
+          </m:rPr>
+          <m:t>−</m:t>
+        </m:r>
+        <m:r>
+          <m:t>5</m:t>
+        </m:r>
+        <m:r>
+          <m:t> </m:t>
+        </m:r>
+        <m:r>
+          <m:t>i</m:t>
+        </m:r>
+      </m:oMath>
+      <w:r>
+        <w:t xml:space="preserve">.</w:t>
       </w:r>
     </w:p>
     <w:p>
@@ -3995,6 +3422,720 @@
         <w:pStyle w:val="BodyText"/>
       </w:pPr>
       <w:r>
+        <w:t xml:space="preserve">The numbers</w:t>
+      </w:r>
+      <w:r>
+        <w:t xml:space="preserve"> </w:t>
+      </w:r>
+      <m:oMath>
+        <m:r>
+          <m:t>1</m:t>
+        </m:r>
+        <m:r>
+          <m:rPr>
+            <m:sty m:val="p"/>
+          </m:rPr>
+          <m:t>+</m:t>
+        </m:r>
+        <m:r>
+          <m:t>i</m:t>
+        </m:r>
+      </m:oMath>
+      <w:r>
+        <w:t xml:space="preserve"> </w:t>
+      </w:r>
+      <w:r>
+        <w:t xml:space="preserve">and</w:t>
+      </w:r>
+      <w:r>
+        <w:t xml:space="preserve"> </w:t>
+      </w:r>
+      <m:oMath>
+        <m:r>
+          <m:t>1</m:t>
+        </m:r>
+        <m:r>
+          <m:rPr>
+            <m:sty m:val="p"/>
+          </m:rPr>
+          <m:t>−</m:t>
+        </m:r>
+        <m:r>
+          <m:t>i</m:t>
+        </m:r>
+      </m:oMath>
+      <w:r>
+        <w:t xml:space="preserve"> </w:t>
+      </w:r>
+      <w:r>
+        <w:t xml:space="preserve">have the same real part,</w:t>
+      </w:r>
+      <w:r>
+        <w:t xml:space="preserve"> </w:t>
+      </w:r>
+      <m:oMath>
+        <m:r>
+          <m:t>1</m:t>
+        </m:r>
+      </m:oMath>
+      <w:r>
+        <w:t xml:space="preserve">,</w:t>
+      </w:r>
+      <w:r>
+        <w:t xml:space="preserve"> </w:t>
+      </w:r>
+      <w:r>
+        <w:t xml:space="preserve">but different imaginary parts,</w:t>
+      </w:r>
+      <w:r>
+        <w:t xml:space="preserve"> </w:t>
+      </w:r>
+      <m:oMath>
+        <m:r>
+          <m:t>1</m:t>
+        </m:r>
+      </m:oMath>
+      <w:r>
+        <w:t xml:space="preserve"> </w:t>
+      </w:r>
+      <w:r>
+        <w:t xml:space="preserve">and</w:t>
+      </w:r>
+      <w:r>
+        <w:t xml:space="preserve"> </w:t>
+      </w:r>
+      <m:oMath>
+        <m:r>
+          <m:rPr>
+            <m:sty m:val="p"/>
+          </m:rPr>
+          <m:t>−</m:t>
+        </m:r>
+        <m:r>
+          <m:t>1</m:t>
+        </m:r>
+      </m:oMath>
+      <w:r>
+        <w:t xml:space="preserve">,</w:t>
+      </w:r>
+      <w:r>
+        <w:t xml:space="preserve"> </w:t>
+      </w:r>
+      <w:r>
+        <w:t xml:space="preserve">so they are different complex numbers.</w:t>
+      </w:r>
+    </w:p>
+    <w:p>
+      <w:pPr>
+        <w:pStyle w:val="BodyText"/>
+      </w:pPr>
+      <w:r>
+        <w:t xml:space="preserve">The real number</w:t>
+      </w:r>
+      <w:r>
+        <w:t xml:space="preserve"> </w:t>
+      </w:r>
+      <m:oMath>
+        <m:r>
+          <m:t>7</m:t>
+        </m:r>
+      </m:oMath>
+      <w:r>
+        <w:t xml:space="preserve"> </w:t>
+      </w:r>
+      <w:r>
+        <w:t xml:space="preserve">is the complex number</w:t>
+      </w:r>
+      <w:r>
+        <w:t xml:space="preserve"> </w:t>
+      </w:r>
+      <m:oMath>
+        <m:r>
+          <m:t>7</m:t>
+        </m:r>
+        <m:r>
+          <m:rPr>
+            <m:sty m:val="p"/>
+          </m:rPr>
+          <m:t>+</m:t>
+        </m:r>
+        <m:r>
+          <m:t>0</m:t>
+        </m:r>
+        <m:r>
+          <m:t> </m:t>
+        </m:r>
+        <m:r>
+          <m:t>i</m:t>
+        </m:r>
+      </m:oMath>
+      <w:r>
+        <w:t xml:space="preserve">,</w:t>
+      </w:r>
+      <w:r>
+        <w:t xml:space="preserve"> </w:t>
+      </w:r>
+      <w:r>
+        <w:t xml:space="preserve">with real part</w:t>
+      </w:r>
+      <w:r>
+        <w:t xml:space="preserve"> </w:t>
+      </w:r>
+      <m:oMath>
+        <m:r>
+          <m:t>7</m:t>
+        </m:r>
+      </m:oMath>
+      <w:r>
+        <w:t xml:space="preserve"> </w:t>
+      </w:r>
+      <w:r>
+        <w:t xml:space="preserve">and imaginary part</w:t>
+      </w:r>
+      <w:r>
+        <w:t xml:space="preserve"> </w:t>
+      </w:r>
+      <m:oMath>
+        <m:r>
+          <m:t>0</m:t>
+        </m:r>
+      </m:oMath>
+      <w:r>
+        <w:t xml:space="preserve">.</w:t>
+      </w:r>
+    </w:p>
+    <w:bookmarkEnd w:id="22"/>
+    <w:bookmarkStart w:id="23" w:name="thm-reals-in-complex"/>
+    <w:p>
+      <w:pPr>
+        <w:pStyle w:val="BodyText"/>
+      </w:pPr>
+      <w:r>
+        <w:rPr>
+          <w:b/>
+          <w:bCs/>
+        </w:rPr>
+        <w:t xml:space="preserve">Theorem 2 (Every real number is a complex number)</w:t>
+      </w:r>
+      <w:r>
+        <w:t xml:space="preserve"> </w:t>
+      </w:r>
+      <w:r>
+        <w:t xml:space="preserve">A complex number</w:t>
+      </w:r>
+      <w:r>
+        <w:t xml:space="preserve"> </w:t>
+      </w:r>
+      <m:oMath>
+        <m:r>
+          <m:t>z</m:t>
+        </m:r>
+      </m:oMath>
+      <w:r>
+        <w:t xml:space="preserve"> </w:t>
+      </w:r>
+      <w:r>
+        <w:t xml:space="preserve">is a real number exactly when</w:t>
+      </w:r>
+      <w:r>
+        <w:t xml:space="preserve"> </w:t>
+      </w:r>
+      <m:oMath>
+        <m:r>
+          <m:rPr>
+            <m:sty m:val="p"/>
+          </m:rPr>
+          <m:t>Im</m:t>
+        </m:r>
+        <m:r>
+          <m:t>z</m:t>
+        </m:r>
+        <m:r>
+          <m:rPr>
+            <m:sty m:val="p"/>
+          </m:rPr>
+          <m:t>=</m:t>
+        </m:r>
+        <m:r>
+          <m:t>0</m:t>
+        </m:r>
+      </m:oMath>
+      <w:r>
+        <w:t xml:space="preserve">.</w:t>
+      </w:r>
+      <w:r>
+        <w:t xml:space="preserve"> </w:t>
+      </w:r>
+      <w:r>
+        <w:t xml:space="preserve">In particular, every real number</w:t>
+      </w:r>
+      <w:r>
+        <w:t xml:space="preserve"> </w:t>
+      </w:r>
+      <m:oMath>
+        <m:r>
+          <m:t>a</m:t>
+        </m:r>
+      </m:oMath>
+      <w:r>
+        <w:t xml:space="preserve"> </w:t>
+      </w:r>
+      <w:r>
+        <w:t xml:space="preserve">is the complex number</w:t>
+      </w:r>
+      <w:r>
+        <w:t xml:space="preserve"> </w:t>
+      </w:r>
+      <m:oMath>
+        <m:r>
+          <m:t>a</m:t>
+        </m:r>
+        <m:r>
+          <m:rPr>
+            <m:sty m:val="p"/>
+          </m:rPr>
+          <m:t>+</m:t>
+        </m:r>
+        <m:r>
+          <m:t>0</m:t>
+        </m:r>
+        <m:r>
+          <m:t> </m:t>
+        </m:r>
+        <m:r>
+          <m:t>i</m:t>
+        </m:r>
+      </m:oMath>
+      <w:r>
+        <w:t xml:space="preserve">,</w:t>
+      </w:r>
+      <w:r>
+        <w:t xml:space="preserve"> </w:t>
+      </w:r>
+      <w:r>
+        <w:t xml:space="preserve">with</w:t>
+      </w:r>
+      <w:r>
+        <w:t xml:space="preserve"> </w:t>
+      </w:r>
+      <m:oMath>
+        <m:r>
+          <m:rPr>
+            <m:sty m:val="p"/>
+          </m:rPr>
+          <m:t>Re</m:t>
+        </m:r>
+        <m:r>
+          <m:t>a</m:t>
+        </m:r>
+        <m:r>
+          <m:rPr>
+            <m:sty m:val="p"/>
+          </m:rPr>
+          <m:t>=</m:t>
+        </m:r>
+        <m:r>
+          <m:t>a</m:t>
+        </m:r>
+      </m:oMath>
+      <w:r>
+        <w:t xml:space="preserve"> </w:t>
+      </w:r>
+      <w:r>
+        <w:t xml:space="preserve">and</w:t>
+      </w:r>
+      <w:r>
+        <w:t xml:space="preserve"> </w:t>
+      </w:r>
+      <m:oMath>
+        <m:r>
+          <m:rPr>
+            <m:sty m:val="p"/>
+          </m:rPr>
+          <m:t>Im</m:t>
+        </m:r>
+        <m:r>
+          <m:t>a</m:t>
+        </m:r>
+        <m:r>
+          <m:rPr>
+            <m:sty m:val="p"/>
+          </m:rPr>
+          <m:t>=</m:t>
+        </m:r>
+        <m:r>
+          <m:t>0</m:t>
+        </m:r>
+      </m:oMath>
+      <w:r>
+        <w:t xml:space="preserve">,</w:t>
+      </w:r>
+      <w:r>
+        <w:t xml:space="preserve"> </w:t>
+      </w:r>
+      <w:r>
+        <w:t xml:space="preserve">so</w:t>
+      </w:r>
+      <w:r>
+        <w:t xml:space="preserve"> </w:t>
+      </w:r>
+      <m:oMath>
+        <m:r>
+          <m:rPr>
+            <m:scr m:val="double-struck"/>
+            <m:sty m:val="p"/>
+          </m:rPr>
+          <m:t>R</m:t>
+        </m:r>
+      </m:oMath>
+      <w:r>
+        <w:t xml:space="preserve"> </w:t>
+      </w:r>
+      <w:r>
+        <w:t xml:space="preserve">is a subset of</w:t>
+      </w:r>
+      <w:r>
+        <w:t xml:space="preserve"> </w:t>
+      </w:r>
+      <m:oMath>
+        <m:r>
+          <m:rPr>
+            <m:scr m:val="double-struck"/>
+            <m:sty m:val="p"/>
+          </m:rPr>
+          <m:t>C</m:t>
+        </m:r>
+      </m:oMath>
+      <w:r>
+        <w:t xml:space="preserve">.</w:t>
+      </w:r>
+    </w:p>
+    <w:bookmarkEnd w:id="23"/>
+    <w:p>
+      <w:pPr>
+        <w:pStyle w:val="BodyText"/>
+      </w:pPr>
+      <w:r>
+        <w:rPr>
+          <w:i/>
+          <w:iCs/>
+        </w:rPr>
+        <w:t xml:space="preserve">Proof</w:t>
+      </w:r>
+      <w:r>
+        <w:t xml:space="preserve">. </w:t>
+      </w:r>
+      <w:r>
+        <w:t xml:space="preserve">Let</w:t>
+      </w:r>
+      <w:r>
+        <w:t xml:space="preserve"> </w:t>
+      </w:r>
+      <m:oMath>
+        <m:r>
+          <m:t>a</m:t>
+        </m:r>
+      </m:oMath>
+      <w:r>
+        <w:t xml:space="preserve"> </w:t>
+      </w:r>
+      <w:r>
+        <w:t xml:space="preserve">be a real number.</w:t>
+      </w:r>
+      <w:r>
+        <w:t xml:space="preserve"> </w:t>
+      </w:r>
+      <w:r>
+        <w:t xml:space="preserve">Since</w:t>
+      </w:r>
+      <w:r>
+        <w:t xml:space="preserve"> </w:t>
+      </w:r>
+      <m:oMath>
+        <m:r>
+          <m:t>0</m:t>
+        </m:r>
+        <m:r>
+          <m:t> </m:t>
+        </m:r>
+        <m:r>
+          <m:t>i</m:t>
+        </m:r>
+        <m:r>
+          <m:rPr>
+            <m:sty m:val="p"/>
+          </m:rPr>
+          <m:t>=</m:t>
+        </m:r>
+        <m:r>
+          <m:t>0</m:t>
+        </m:r>
+      </m:oMath>
+      <w:r>
+        <w:t xml:space="preserve">,</w:t>
+      </w:r>
+    </w:p>
+    <w:p>
+      <w:pPr>
+        <w:pStyle w:val="BodyText"/>
+      </w:pPr>
+      <m:oMathPara>
+        <m:oMathParaPr>
+          <m:jc m:val="center"/>
+        </m:oMathParaPr>
+        <m:oMath>
+          <m:eqArr>
+            <m:e>
+              <m:r>
+                <m:t>a</m:t>
+              </m:r>
+              <m:r>
+                <m:rPr>
+                  <m:sty m:val="p"/>
+                </m:rPr>
+                <m:t>+</m:t>
+              </m:r>
+              <m:r>
+                <m:t>0</m:t>
+              </m:r>
+              <m:r>
+                <m:t> </m:t>
+              </m:r>
+              <m:r>
+                <m:t>i</m:t>
+              </m:r>
+              <m:r>
+                <m:t>&amp;</m:t>
+              </m:r>
+              <m:r>
+                <m:rPr>
+                  <m:sty m:val="p"/>
+                </m:rPr>
+                <m:t>=</m:t>
+              </m:r>
+              <m:r>
+                <m:t>a</m:t>
+              </m:r>
+              <m:r>
+                <m:rPr>
+                  <m:sty m:val="p"/>
+                </m:rPr>
+                <m:t>+</m:t>
+              </m:r>
+              <m:r>
+                <m:t>0</m:t>
+              </m:r>
+              <m:r>
+                <m:t>&amp;</m:t>
+              </m:r>
+              <m:r>
+                <m:t>&amp;</m:t>
+              </m:r>
+              <m:r>
+                <m:rPr>
+                  <m:nor/>
+                  <m:sty m:val="p"/>
+                </m:rPr>
+                <m:t>(</m:t>
+              </m:r>
+              <m:r>
+                <m:t>0</m:t>
+              </m:r>
+              <m:r>
+                <m:t> </m:t>
+              </m:r>
+              <m:r>
+                <m:t>i</m:t>
+              </m:r>
+              <m:r>
+                <m:rPr>
+                  <m:sty m:val="p"/>
+                </m:rPr>
+                <m:t>=</m:t>
+              </m:r>
+              <m:r>
+                <m:t>0</m:t>
+              </m:r>
+              <m:r>
+                <m:rPr>
+                  <m:nor/>
+                  <m:sty m:val="p"/>
+                </m:rPr>
+                <m:t>)</m:t>
+              </m:r>
+            </m:e>
+            <m:e>
+              <m:r>
+                <m:t>&amp;</m:t>
+              </m:r>
+              <m:r>
+                <m:rPr>
+                  <m:sty m:val="p"/>
+                </m:rPr>
+                <m:t>=</m:t>
+              </m:r>
+              <m:r>
+                <m:t>a</m:t>
+              </m:r>
+              <m:r>
+                <m:t>&amp;</m:t>
+              </m:r>
+              <m:r>
+                <m:t>&amp;</m:t>
+              </m:r>
+              <m:r>
+                <m:rPr>
+                  <m:nor/>
+                  <m:sty m:val="p"/>
+                </m:rPr>
+                <m:t>(</m:t>
+              </m:r>
+              <m:r>
+                <m:rPr>
+                  <m:nor/>
+                  <m:sty m:val="p"/>
+                </m:rPr>
+                <m:t>Theorem 4 in Convexity, Infimum and Sums</m:t>
+              </m:r>
+              <m:r>
+                <m:rPr>
+                  <m:nor/>
+                  <m:sty m:val="p"/>
+                </m:rPr>
+                <m:t>)</m:t>
+              </m:r>
+            </m:e>
+          </m:eqArr>
+        </m:oMath>
+      </m:oMathPara>
+    </w:p>
+    <w:p>
+      <w:pPr>
+        <w:pStyle w:val="FirstParagraph"/>
+      </w:pPr>
+      <w:r>
+        <w:t xml:space="preserve">so</w:t>
+      </w:r>
+      <w:r>
+        <w:t xml:space="preserve"> </w:t>
+      </w:r>
+      <m:oMath>
+        <m:r>
+          <m:t>a</m:t>
+        </m:r>
+      </m:oMath>
+      <w:r>
+        <w:t xml:space="preserve"> </w:t>
+      </w:r>
+      <w:r>
+        <w:t xml:space="preserve">is the complex number</w:t>
+      </w:r>
+      <w:r>
+        <w:t xml:space="preserve"> </w:t>
+      </w:r>
+      <m:oMath>
+        <m:r>
+          <m:t>a</m:t>
+        </m:r>
+        <m:r>
+          <m:rPr>
+            <m:sty m:val="p"/>
+          </m:rPr>
+          <m:t>+</m:t>
+        </m:r>
+        <m:r>
+          <m:t>0</m:t>
+        </m:r>
+        <m:r>
+          <m:t> </m:t>
+        </m:r>
+        <m:r>
+          <m:t>i</m:t>
+        </m:r>
+      </m:oMath>
+      <w:r>
+        <w:t xml:space="preserve">, whose imaginary part is</w:t>
+      </w:r>
+      <w:r>
+        <w:t xml:space="preserve"> </w:t>
+      </w:r>
+      <m:oMath>
+        <m:r>
+          <m:t>0</m:t>
+        </m:r>
+      </m:oMath>
+      <w:r>
+        <w:t xml:space="preserve">.</w:t>
+      </w:r>
+      <w:r>
+        <w:t xml:space="preserve"> </w:t>
+      </w:r>
+      <w:r>
+        <w:t xml:space="preserve">The real part of</w:t>
+      </w:r>
+      <w:r>
+        <w:t xml:space="preserve"> </w:t>
+      </w:r>
+      <m:oMath>
+        <m:r>
+          <m:t>a</m:t>
+        </m:r>
+        <m:r>
+          <m:rPr>
+            <m:sty m:val="p"/>
+          </m:rPr>
+          <m:t>+</m:t>
+        </m:r>
+        <m:r>
+          <m:t>0</m:t>
+        </m:r>
+        <m:r>
+          <m:t> </m:t>
+        </m:r>
+        <m:r>
+          <m:t>i</m:t>
+        </m:r>
+      </m:oMath>
+      <w:r>
+        <w:t xml:space="preserve"> </w:t>
+      </w:r>
+      <w:r>
+        <w:t xml:space="preserve">is</w:t>
+      </w:r>
+      <w:r>
+        <w:t xml:space="preserve"> </w:t>
+      </w:r>
+      <m:oMath>
+        <m:r>
+          <m:t>a</m:t>
+        </m:r>
+      </m:oMath>
+      <w:r>
+        <w:t xml:space="preserve">, and by the equality rule in</w:t>
+      </w:r>
+      <w:r>
+        <w:t xml:space="preserve"> </w:t>
+      </w:r>
+      <w:hyperlink w:anchor="def-complex-equality">
+        <w:r>
+          <w:rPr>
+            <w:rStyle w:val="Hyperlink"/>
+          </w:rPr>
+          <w:t xml:space="preserve">Definition 5</w:t>
+        </w:r>
+      </w:hyperlink>
+      <w:r>
+        <w:t xml:space="preserve"> </w:t>
+      </w:r>
+      <w:r>
+        <w:t xml:space="preserve">no other pair of real and imaginary parts gives the same number.</w:t>
+      </w:r>
+    </w:p>
+    <w:p>
+      <w:pPr>
+        <w:pStyle w:val="BodyText"/>
+      </w:pPr>
+      <w:r>
         <w:t xml:space="preserve">Conversely, if</w:t>
       </w:r>
       <w:r>
@@ -4132,7 +4273,7 @@
         <w:t xml:space="preserve">is real.</w:t>
       </w:r>
     </w:p>
-    <w:bookmarkStart w:id="21" w:name="exm-reals-in-complex"/>
+    <w:bookmarkStart w:id="24" w:name="exm-reals-in-complex"/>
     <w:p>
       <w:pPr>
         <w:pStyle w:val="BodyText"/>
@@ -4594,8 +4735,8 @@
         <w:t xml:space="preserve">is not real, because its imaginary part is -5.</w:t>
       </w:r>
     </w:p>
-    <w:bookmarkEnd w:id="21"/>
-    <w:bookmarkStart w:id="22" w:name="thm-complex-arithmetic"/>
+    <w:bookmarkEnd w:id="24"/>
+    <w:bookmarkStart w:id="25" w:name="thm-complex-arithmetic"/>
     <w:p>
       <w:pPr>
         <w:pStyle w:val="BodyText"/>
@@ -4960,7 +5101,7 @@
         </m:oMath>
       </m:oMathPara>
     </w:p>
-    <w:bookmarkEnd w:id="22"/>
+    <w:bookmarkEnd w:id="25"/>
     <w:p>
       <w:pPr>
         <w:pStyle w:val="FirstParagraph"/>
@@ -5614,7 +5755,7 @@
         <w:t xml:space="preserve">takes these two formulas as the definitions of addition and multiplication.</w:t>
       </w:r>
     </w:p>
-    <w:bookmarkStart w:id="23" w:name="exm-complex-arithmetic"/>
+    <w:bookmarkStart w:id="26" w:name="exm-complex-arithmetic"/>
     <w:p>
       <w:pPr>
         <w:pStyle w:val="BodyText"/>
@@ -6637,8 +6778,8 @@
         </m:oMath>
       </m:oMathPara>
     </w:p>
-    <w:bookmarkEnd w:id="23"/>
-    <w:bookmarkStart w:id="24" w:name="def-complex-conjugate"/>
+    <w:bookmarkEnd w:id="26"/>
+    <w:bookmarkStart w:id="27" w:name="def-complex-conjugate"/>
     <w:p>
       <w:pPr>
         <w:pStyle w:val="FirstParagraph"/>
@@ -6648,7 +6789,7 @@
           <w:b/>
           <w:bCs/>
         </w:rPr>
-        <w:t xml:space="preserve">Definition 3 (Complex conjugate)</w:t>
+        <w:t xml:space="preserve">Definition 6 (Complex conjugate)</w:t>
       </w:r>
       <w:r>
         <w:t xml:space="preserve"> </w:t>
@@ -6787,7 +6928,7 @@
         </m:oMath>
       </m:oMathPara>
     </w:p>
-    <w:bookmarkEnd w:id="24"/>
+    <w:bookmarkEnd w:id="27"/>
     <w:p>
       <w:pPr>
         <w:pStyle w:val="FirstParagraph"/>
@@ -6868,7 +7009,7 @@
         <w:t xml:space="preserve">.</w:t>
       </w:r>
     </w:p>
-    <w:bookmarkStart w:id="25" w:name="exm-complex-conjugate"/>
+    <w:bookmarkStart w:id="28" w:name="exm-complex-conjugate"/>
     <w:p>
       <w:pPr>
         <w:pStyle w:val="BodyText"/>
@@ -6891,7 +7032,7 @@
       <w:pPr>
         <w:numPr>
           <w:ilvl w:val="0"/>
-          <w:numId w:val="1004"/>
+          <w:numId w:val="1003"/>
         </w:numPr>
       </w:pPr>
       <m:oMath>
@@ -7264,8 +7405,8 @@
         <w:t xml:space="preserve">, is not.</w:t>
       </w:r>
     </w:p>
-    <w:bookmarkEnd w:id="25"/>
-    <w:bookmarkStart w:id="26" w:name="def-complex-modulus"/>
+    <w:bookmarkEnd w:id="28"/>
+    <w:bookmarkStart w:id="29" w:name="def-complex-modulus"/>
     <w:p>
       <w:pPr>
         <w:pStyle w:val="FirstParagraph"/>
@@ -7275,7 +7416,7 @@
           <w:b/>
           <w:bCs/>
         </w:rPr>
-        <w:t xml:space="preserve">Definition 4 (Absolute value (modulus) of a complex number)</w:t>
+        <w:t xml:space="preserve">Definition 7 (Absolute value (modulus) of a complex number)</w:t>
       </w:r>
       <w:r>
         <w:t xml:space="preserve"> </w:t>
@@ -7453,7 +7594,7 @@
         </m:oMath>
       </m:oMathPara>
     </w:p>
-    <w:bookmarkEnd w:id="26"/>
+    <w:bookmarkEnd w:id="29"/>
     <w:p>
       <w:pPr>
         <w:pStyle w:val="FirstParagraph"/>
@@ -7468,7 +7609,7 @@
         <w:t xml:space="preserve">gives the same definition.</w:t>
       </w:r>
     </w:p>
-    <w:bookmarkStart w:id="27" w:name="exm-complex-modulus"/>
+    <w:bookmarkStart w:id="30" w:name="exm-complex-modulus"/>
     <w:p>
       <w:pPr>
         <w:pStyle w:val="BodyText"/>
@@ -7784,7 +7925,7 @@
       <w:pPr>
         <w:numPr>
           <w:ilvl w:val="0"/>
-          <w:numId w:val="1005"/>
+          <w:numId w:val="1004"/>
         </w:numPr>
       </w:pPr>
       <w:r>
@@ -8054,8 +8195,8 @@
         </m:oMath>
       </m:oMathPara>
     </w:p>
-    <w:bookmarkEnd w:id="27"/>
-    <w:bookmarkStart w:id="28" w:name="thm-conj-product"/>
+    <w:bookmarkEnd w:id="30"/>
+    <w:bookmarkStart w:id="31" w:name="thm-conj-product"/>
     <w:p>
       <w:pPr>
         <w:pStyle w:val="FirstParagraph"/>
@@ -8188,7 +8329,7 @@
         <w:t xml:space="preserve">is a nonnegative real number.</w:t>
       </w:r>
     </w:p>
-    <w:bookmarkEnd w:id="28"/>
+    <w:bookmarkEnd w:id="31"/>
     <w:p>
       <w:pPr>
         <w:pStyle w:val="BodyText"/>
@@ -8382,7 +8523,7 @@
                   <m:nor/>
                   <m:sty m:val="p"/>
                 </m:rPr>
-                <m:t>Definition 3</m:t>
+                <m:t>Definition 6</m:t>
               </m:r>
               <m:r>
                 <m:rPr>
@@ -8709,7 +8850,7 @@
                   <m:nor/>
                   <m:sty m:val="p"/>
                 </m:rPr>
-                <m:t>Definition 4</m:t>
+                <m:t>Definition 7</m:t>
               </m:r>
               <m:r>
                 <m:rPr>
@@ -8737,7 +8878,7 @@
         <w:t xml:space="preserve">lists this identity among the properties of complex numbers.</w:t>
       </w:r>
     </w:p>
-    <w:bookmarkStart w:id="29" w:name="exm-conj-product"/>
+    <w:bookmarkStart w:id="32" w:name="exm-conj-product"/>
     <w:p>
       <w:pPr>
         <w:pStyle w:val="BodyText"/>
@@ -9206,9 +9347,9 @@
         <w:t xml:space="preserve">says.</w:t>
       </w:r>
     </w:p>
-    <w:bookmarkEnd w:id="29"/>
-    <w:bookmarkStart w:id="32" w:name="refs"/>
-    <w:bookmarkStart w:id="31" w:name="ref-axler2024linear"/>
+    <w:bookmarkEnd w:id="32"/>
+    <w:bookmarkStart w:id="35" w:name="refs"/>
+    <w:bookmarkStart w:id="34" w:name="ref-axler2024linear"/>
     <w:p>
       <w:pPr>
         <w:pStyle w:val="Bibliography"/>
@@ -9232,7 +9373,7 @@
       <w:r>
         <w:t xml:space="preserve"> </w:t>
       </w:r>
-      <w:hyperlink r:id="rId30">
+      <w:hyperlink r:id="rId33">
         <w:r>
           <w:rPr>
             <w:rStyle w:val="Hyperlink"/>
@@ -9244,9 +9385,9 @@
         <w:t xml:space="preserve">.</w:t>
       </w:r>
     </w:p>
-    <w:bookmarkEnd w:id="31"/>
-    <w:bookmarkEnd w:id="32"/>
-    <w:bookmarkEnd w:id="33"/>
+    <w:bookmarkEnd w:id="34"/>
+    <w:bookmarkEnd w:id="35"/>
+    <w:bookmarkEnd w:id="36"/>
     <w:sectPr>
       <w:footnotePr>
         <w:numRestart w:val="eachSect"/>
@@ -9473,9 +9614,6 @@
     <w:abstractNumId w:val="991"/>
   </w:num>
   <w:num w:numId="1004">
-    <w:abstractNumId w:val="991"/>
-  </w:num>
-  <w:num w:numId="1005">
     <w:abstractNumId w:val="991"/>
   </w:num>
 </w:numbering>

</xml_diff>